<commit_message>
Added Week8 HOL documents
</commit_message>
<xml_diff>
--- a/Week8/Git-HOL-1.docx
+++ b/Week8/Git-HOL-1.docx
@@ -165,217 +165,22 @@
     <w:p>
       <w:pPr>
         <w:pStyle w:val="ListParagraph"/>
-        <w:rPr>
-          <w:sz w:val="24"/>
-          <w:szCs w:val="24"/>
-          <w:lang w:val="en-US"/>
-        </w:rPr>
-      </w:pPr>
-    </w:p>
-    <w:p>
-      <w:pPr>
-        <w:pStyle w:val="ListParagraph"/>
         <w:numPr>
           <w:ilvl w:val="0"/>
           <w:numId w:val="1"/>
         </w:numPr>
         <w:rPr>
-          <w:sz w:val="24"/>
-          <w:szCs w:val="24"/>
+          <w:sz w:val="28"/>
+          <w:szCs w:val="28"/>
           <w:lang w:val="en-US"/>
         </w:rPr>
       </w:pPr>
       <w:r>
         <w:rPr>
-          <w:sz w:val="24"/>
-          <w:szCs w:val="24"/>
-          <w:lang w:val="en-US"/>
-        </w:rPr>
-        <w:t xml:space="preserve">Git Configuration </w:t>
-      </w:r>
-    </w:p>
-    <w:p>
-      <w:pPr>
-        <w:pStyle w:val="ListParagraph"/>
-        <w:rPr>
-          <w:sz w:val="24"/>
-          <w:szCs w:val="24"/>
-          <w:lang w:val="en-US"/>
-        </w:rPr>
-      </w:pPr>
-    </w:p>
-    <w:p>
-      <w:pPr>
-        <w:pStyle w:val="ListParagraph"/>
-        <w:rPr>
-          <w:sz w:val="24"/>
-          <w:szCs w:val="24"/>
-          <w:lang w:val="en-US"/>
-        </w:rPr>
-      </w:pPr>
-      <w:r>
-        <w:rPr>
-          <w:sz w:val="24"/>
-          <w:szCs w:val="24"/>
-          <w:lang w:val="en-US"/>
-        </w:rPr>
-        <w:t xml:space="preserve">I have used git before </w:t>
-      </w:r>
-      <w:proofErr w:type="gramStart"/>
-      <w:r>
-        <w:rPr>
-          <w:sz w:val="24"/>
-          <w:szCs w:val="24"/>
-          <w:lang w:val="en-US"/>
-        </w:rPr>
-        <w:t>therefore,</w:t>
-      </w:r>
-      <w:proofErr w:type="gramEnd"/>
-      <w:r>
-        <w:rPr>
-          <w:sz w:val="24"/>
-          <w:szCs w:val="24"/>
-          <w:lang w:val="en-US"/>
-        </w:rPr>
-        <w:t xml:space="preserve"> configuration was already setup.</w:t>
-      </w:r>
-    </w:p>
-    <w:p>
-      <w:pPr>
-        <w:pStyle w:val="ListParagraph"/>
-        <w:rPr>
-          <w:sz w:val="24"/>
-          <w:szCs w:val="24"/>
-          <w:lang w:val="en-US"/>
-        </w:rPr>
-      </w:pPr>
-      <w:r>
-        <w:rPr>
-          <w:sz w:val="24"/>
-          <w:szCs w:val="24"/>
-          <w:lang w:val="en-US"/>
-        </w:rPr>
-        <w:t>(The screenshot was taken after setting up Notepad++ as default editor.</w:t>
-      </w:r>
-    </w:p>
-    <w:p>
-      <w:pPr>
-        <w:pStyle w:val="ListParagraph"/>
-        <w:rPr>
-          <w:sz w:val="24"/>
-          <w:szCs w:val="24"/>
-          <w:lang w:val="en-US"/>
-        </w:rPr>
-      </w:pPr>
-      <w:r>
-        <w:rPr>
-          <w:sz w:val="24"/>
-          <w:szCs w:val="24"/>
-          <w:lang w:val="en-US"/>
-        </w:rPr>
-        <w:t>Therefore, it is also displaying that.)</w:t>
-      </w:r>
-    </w:p>
-    <w:p>
-      <w:pPr>
-        <w:pStyle w:val="ListParagraph"/>
-        <w:rPr>
-          <w:sz w:val="28"/>
-          <w:szCs w:val="28"/>
-          <w:lang w:val="en-US"/>
-        </w:rPr>
-      </w:pPr>
-      <w:r>
-        <w:rPr>
-          <w:noProof/>
-          <w:sz w:val="28"/>
-          <w:szCs w:val="28"/>
-          <w:lang w:val="en-US"/>
-        </w:rPr>
-        <w:drawing>
-          <wp:anchor distT="0" distB="0" distL="114300" distR="114300" simplePos="0" relativeHeight="251659264" behindDoc="0" locked="0" layoutInCell="1" allowOverlap="1" wp14:anchorId="6F789EF3" wp14:editId="45BA37D2">
-            <wp:simplePos x="0" y="0"/>
-            <wp:positionH relativeFrom="margin">
-              <wp:posOffset>501650</wp:posOffset>
-            </wp:positionH>
-            <wp:positionV relativeFrom="paragraph">
-              <wp:posOffset>267335</wp:posOffset>
-            </wp:positionV>
-            <wp:extent cx="4826635" cy="2915920"/>
-            <wp:effectExtent l="0" t="0" r="0" b="0"/>
-            <wp:wrapSquare wrapText="bothSides"/>
-            <wp:docPr id="1580451840" name="Picture 2"/>
-            <wp:cNvGraphicFramePr>
-              <a:graphicFrameLocks xmlns:a="http://schemas.openxmlformats.org/drawingml/2006/main" noChangeAspect="1"/>
-            </wp:cNvGraphicFramePr>
-            <a:graphic xmlns:a="http://schemas.openxmlformats.org/drawingml/2006/main">
-              <a:graphicData uri="http://schemas.openxmlformats.org/drawingml/2006/picture">
-                <pic:pic xmlns:pic="http://schemas.openxmlformats.org/drawingml/2006/picture">
-                  <pic:nvPicPr>
-                    <pic:cNvPr id="0" name="Picture 2"/>
-                    <pic:cNvPicPr>
-                      <a:picLocks noChangeAspect="1" noChangeArrowheads="1"/>
-                    </pic:cNvPicPr>
-                  </pic:nvPicPr>
-                  <pic:blipFill>
-                    <a:blip r:embed="rId8">
-                      <a:extLst>
-                        <a:ext uri="{28A0092B-C50C-407E-A947-70E740481C1C}">
-                          <a14:useLocalDpi xmlns:a14="http://schemas.microsoft.com/office/drawing/2010/main" val="0"/>
-                        </a:ext>
-                      </a:extLst>
-                    </a:blip>
-                    <a:srcRect/>
-                    <a:stretch>
-                      <a:fillRect/>
-                    </a:stretch>
-                  </pic:blipFill>
-                  <pic:spPr bwMode="auto">
-                    <a:xfrm>
-                      <a:off x="0" y="0"/>
-                      <a:ext cx="4826635" cy="2915920"/>
-                    </a:xfrm>
-                    <a:prstGeom prst="rect">
-                      <a:avLst/>
-                    </a:prstGeom>
-                    <a:noFill/>
-                    <a:ln>
-                      <a:noFill/>
-                    </a:ln>
-                  </pic:spPr>
-                </pic:pic>
-              </a:graphicData>
-            </a:graphic>
-            <wp14:sizeRelH relativeFrom="margin">
-              <wp14:pctWidth>0</wp14:pctWidth>
-            </wp14:sizeRelH>
-            <wp14:sizeRelV relativeFrom="margin">
-              <wp14:pctHeight>0</wp14:pctHeight>
-            </wp14:sizeRelV>
-          </wp:anchor>
-        </w:drawing>
-      </w:r>
-    </w:p>
-    <w:p>
-      <w:pPr>
-        <w:pStyle w:val="ListParagraph"/>
-        <w:numPr>
-          <w:ilvl w:val="0"/>
-          <w:numId w:val="1"/>
-        </w:numPr>
-        <w:rPr>
-          <w:sz w:val="28"/>
-          <w:szCs w:val="28"/>
-          <w:lang w:val="en-US"/>
-        </w:rPr>
-      </w:pPr>
-      <w:r>
-        <w:rPr>
-          <w:sz w:val="28"/>
-          <w:szCs w:val="28"/>
-          <w:lang w:val="en-US"/>
-        </w:rPr>
-        <w:lastRenderedPageBreak/>
+          <w:sz w:val="28"/>
+          <w:szCs w:val="28"/>
+          <w:lang w:val="en-US"/>
+        </w:rPr>
         <w:t>Integrating Notepad++</w:t>
       </w:r>
     </w:p>
@@ -421,7 +226,7 @@
                     </pic:cNvPicPr>
                   </pic:nvPicPr>
                   <pic:blipFill>
-                    <a:blip r:embed="rId9">
+                    <a:blip r:embed="rId8">
                       <a:extLst>
                         <a:ext uri="{28A0092B-C50C-407E-A947-70E740481C1C}">
                           <a14:useLocalDpi xmlns:a14="http://schemas.microsoft.com/office/drawing/2010/main" val="0"/>
@@ -482,35 +287,26 @@
           <w:szCs w:val="28"/>
           <w:lang w:val="en-US"/>
         </w:rPr>
-        <w:t xml:space="preserve">Creating </w:t>
+        <w:t>Creating GitDemo</w:t>
       </w:r>
-      <w:proofErr w:type="spellStart"/>
+    </w:p>
+    <w:p>
+      <w:pPr>
+        <w:pStyle w:val="ListParagraph"/>
+        <w:rPr>
+          <w:sz w:val="28"/>
+          <w:szCs w:val="28"/>
+          <w:lang w:val="en-US"/>
+        </w:rPr>
+      </w:pPr>
       <w:r>
         <w:rPr>
-          <w:sz w:val="28"/>
-          <w:szCs w:val="28"/>
-          <w:lang w:val="en-US"/>
-        </w:rPr>
-        <w:t>GitDemo</w:t>
-      </w:r>
-      <w:proofErr w:type="spellEnd"/>
-    </w:p>
-    <w:p>
-      <w:pPr>
-        <w:pStyle w:val="ListParagraph"/>
-        <w:rPr>
-          <w:sz w:val="28"/>
-          <w:szCs w:val="28"/>
-          <w:lang w:val="en-US"/>
-        </w:rPr>
-      </w:pPr>
-      <w:r>
-        <w:rPr>
           <w:noProof/>
           <w:sz w:val="28"/>
           <w:szCs w:val="28"/>
           <w:lang w:val="en-US"/>
         </w:rPr>
+        <w:lastRenderedPageBreak/>
         <w:drawing>
           <wp:anchor distT="0" distB="0" distL="114300" distR="114300" simplePos="0" relativeHeight="251661312" behindDoc="0" locked="0" layoutInCell="1" allowOverlap="1" wp14:anchorId="2C2996C2" wp14:editId="2D42C68F">
             <wp:simplePos x="0" y="0"/>
@@ -537,7 +333,7 @@
                     </pic:cNvPicPr>
                   </pic:nvPicPr>
                   <pic:blipFill>
-                    <a:blip r:embed="rId10">
+                    <a:blip r:embed="rId9">
                       <a:extLst>
                         <a:ext uri="{28A0092B-C50C-407E-A947-70E740481C1C}">
                           <a14:useLocalDpi xmlns:a14="http://schemas.microsoft.com/office/drawing/2010/main" val="0"/>
@@ -619,7 +415,6 @@
           <w:szCs w:val="28"/>
           <w:lang w:val="en-US"/>
         </w:rPr>
-        <w:lastRenderedPageBreak/>
         <w:drawing>
           <wp:anchor distT="0" distB="0" distL="114300" distR="114300" simplePos="0" relativeHeight="251662336" behindDoc="0" locked="0" layoutInCell="1" allowOverlap="1" wp14:anchorId="4C679EA6" wp14:editId="148F1538">
             <wp:simplePos x="0" y="0"/>
@@ -646,7 +441,7 @@
                     </pic:cNvPicPr>
                   </pic:nvPicPr>
                   <pic:blipFill>
-                    <a:blip r:embed="rId11">
+                    <a:blip r:embed="rId10">
                       <a:extLst>
                         <a:ext uri="{28A0092B-C50C-407E-A947-70E740481C1C}">
                           <a14:useLocalDpi xmlns:a14="http://schemas.microsoft.com/office/drawing/2010/main" val="0"/>
@@ -716,6 +511,7 @@
           <w:szCs w:val="28"/>
           <w:lang w:val="en-US"/>
         </w:rPr>
+        <w:lastRenderedPageBreak/>
         <w:drawing>
           <wp:anchor distT="0" distB="0" distL="114300" distR="114300" simplePos="0" relativeHeight="251663360" behindDoc="0" locked="0" layoutInCell="1" allowOverlap="1" wp14:anchorId="19263E07" wp14:editId="312E7269">
             <wp:simplePos x="0" y="0"/>
@@ -742,7 +538,7 @@
                     </pic:cNvPicPr>
                   </pic:nvPicPr>
                   <pic:blipFill>
-                    <a:blip r:embed="rId12">
+                    <a:blip r:embed="rId11">
                       <a:extLst>
                         <a:ext uri="{28A0092B-C50C-407E-A947-70E740481C1C}">
                           <a14:useLocalDpi xmlns:a14="http://schemas.microsoft.com/office/drawing/2010/main" val="0"/>
@@ -829,9 +625,8 @@
           <w:noProof/>
           <w:lang w:val="en-US"/>
         </w:rPr>
-        <w:lastRenderedPageBreak/>
         <w:drawing>
-          <wp:anchor distT="0" distB="0" distL="114300" distR="114300" simplePos="0" relativeHeight="251664384" behindDoc="0" locked="0" layoutInCell="1" allowOverlap="1" wp14:anchorId="4F07D187" wp14:editId="171DC662">
+          <wp:anchor distT="0" distB="0" distL="114300" distR="114300" simplePos="0" relativeHeight="251664384" behindDoc="0" locked="0" layoutInCell="1" allowOverlap="1" wp14:anchorId="4F07D187" wp14:editId="174B2C01">
             <wp:simplePos x="0" y="0"/>
             <wp:positionH relativeFrom="margin">
               <wp:align>center</wp:align>
@@ -856,7 +651,7 @@
                     </pic:cNvPicPr>
                   </pic:nvPicPr>
                   <pic:blipFill>
-                    <a:blip r:embed="rId13" cstate="print">
+                    <a:blip r:embed="rId12" cstate="print">
                       <a:extLst>
                         <a:ext uri="{28A0092B-C50C-407E-A947-70E740481C1C}">
                           <a14:useLocalDpi xmlns:a14="http://schemas.microsoft.com/office/drawing/2010/main" val="0"/>
@@ -932,6 +727,7 @@
           <w:szCs w:val="28"/>
           <w:lang w:val="en-US"/>
         </w:rPr>
+        <w:lastRenderedPageBreak/>
         <w:drawing>
           <wp:anchor distT="0" distB="0" distL="114300" distR="114300" simplePos="0" relativeHeight="251665408" behindDoc="0" locked="0" layoutInCell="1" allowOverlap="1" wp14:anchorId="3085C707" wp14:editId="33CB82FC">
             <wp:simplePos x="0" y="0"/>
@@ -958,7 +754,7 @@
                     </pic:cNvPicPr>
                   </pic:nvPicPr>
                   <pic:blipFill>
-                    <a:blip r:embed="rId14">
+                    <a:blip r:embed="rId13">
                       <a:extLst>
                         <a:ext uri="{28A0092B-C50C-407E-A947-70E740481C1C}">
                           <a14:useLocalDpi xmlns:a14="http://schemas.microsoft.com/office/drawing/2010/main" val="0"/>
@@ -1057,7 +853,6 @@
           <w:szCs w:val="28"/>
           <w:lang w:val="en-US"/>
         </w:rPr>
-        <w:lastRenderedPageBreak/>
         <w:t xml:space="preserve">Created Account on GitLab and ran the </w:t>
       </w:r>
       <w:r>
@@ -1085,6 +880,7 @@
           <w:szCs w:val="28"/>
           <w:lang w:val="en-US"/>
         </w:rPr>
+        <w:lastRenderedPageBreak/>
         <w:drawing>
           <wp:anchor distT="0" distB="0" distL="114300" distR="114300" simplePos="0" relativeHeight="251667456" behindDoc="0" locked="0" layoutInCell="1" allowOverlap="1" wp14:anchorId="5DCA73A2" wp14:editId="7CE16D58">
             <wp:simplePos x="0" y="0"/>
@@ -1111,7 +907,7 @@
                     </pic:cNvPicPr>
                   </pic:nvPicPr>
                   <pic:blipFill>
-                    <a:blip r:embed="rId15" cstate="print">
+                    <a:blip r:embed="rId14" cstate="print">
                       <a:extLst>
                         <a:ext uri="{28A0092B-C50C-407E-A947-70E740481C1C}">
                           <a14:useLocalDpi xmlns:a14="http://schemas.microsoft.com/office/drawing/2010/main" val="0"/>
@@ -1181,7 +977,7 @@
                     </pic:cNvPicPr>
                   </pic:nvPicPr>
                   <pic:blipFill>
-                    <a:blip r:embed="rId16">
+                    <a:blip r:embed="rId15">
                       <a:extLst>
                         <a:ext uri="{28A0092B-C50C-407E-A947-70E740481C1C}">
                           <a14:useLocalDpi xmlns:a14="http://schemas.microsoft.com/office/drawing/2010/main" val="0"/>
@@ -1278,7 +1074,7 @@
   <w:abstractNum w:abstractNumId="0" w15:restartNumberingAfterBreak="0">
     <w:nsid w:val="01925F47"/>
     <w:multiLevelType w:val="hybridMultilevel"/>
-    <w:tmpl w:val="02A4A924"/>
+    <w:tmpl w:val="E56CEE7E"/>
     <w:lvl w:ilvl="0" w:tplc="4009000F">
       <w:start w:val="1"/>
       <w:numFmt w:val="decimal"/>
@@ -1973,6 +1769,7 @@
   <w:style w:type="character" w:default="1" w:styleId="DefaultParagraphFont">
     <w:name w:val="Default Paragraph Font"/>
     <w:uiPriority w:val="1"/>
+    <w:semiHidden/>
     <w:unhideWhenUsed/>
   </w:style>
   <w:style w:type="table" w:default="1" w:styleId="TableNormal">

</xml_diff>